<commit_message>
feat(dashboard): strict UX and payload alignments for Hackathon demo
</commit_message>
<xml_diff>
--- a/cam_generator/Credit_Appraisal_Memo.docx
+++ b/cam_generator/Credit_Appraisal_Memo.docx
@@ -83,9 +83,9 @@
       <w:r>
         <w:t>Litigation Cases: True</w:t>
         <w:br/>
-        <w:t>Negative News Ratio: 1/4</w:t>
+        <w:t>Negative News Ratio: 3/6</w:t>
         <w:br/>
-        <w:t>Sector Risk: Technology</w:t>
+        <w:t>Sector Risk: Telecommunications</w:t>
         <w:br/>
         <w:br/>
         <w:t>Factory Utilization: 40%</w:t>

</xml_diff>